<commit_message>
Documento UX v1.2: rechazo de la arquitectura B en UX-01 y UX-02
Co-Authored-By: Claude Opus 5.5 <noreply@anthropic.com>
</commit_message>
<xml_diff>
--- a/docs/03-diseno-ux/Documento_UX_Acelerador_Consolidacion_BPC_CM_Consulting.docx
+++ b/docs/03-diseno-ux/Documento_UX_Acelerador_Consolidacion_BPC_CM_Consulting.docx
@@ -418,6 +418,112 @@
           </w:p>
         </w:tc>
       </w:tr>
+      <w:tr>
+        <w:tc>
+          <w:tcPr>
+            <w:tcW w:w="1200" w:type="dxa"/>
+            <w:tcMar>
+              <w:top w:w="80" w:type="dxa"/>
+              <w:left w:w="120" w:type="dxa"/>
+              <w:bottom w:w="80" w:type="dxa"/>
+              <w:right w:w="120" w:type="dxa"/>
+            </w:tcMar>
+            <w:vAlign w:val="center"/>
+          </w:tcPr>
+          <w:p>
+            <w:pPr>
+              <w:spacing w:after="0"/>
+              <w:jc w:val="both"/>
+            </w:pPr>
+            <w:r>
+              <w:rPr>
+                <w:rFonts w:ascii="Ubuntu" w:hAnsi="Ubuntu" w:cs="Ubuntu"/>
+                <w:sz w:val="21"/>
+                <w:szCs w:val="21"/>
+              </w:rPr>
+              <w:t xml:space="preserve">1.2</w:t>
+            </w:r>
+          </w:p>
+        </w:tc>
+        <w:tc>
+          <w:tcPr>
+            <w:tcW w:w="2200" w:type="dxa"/>
+            <w:tcMar>
+              <w:top w:w="80" w:type="dxa"/>
+              <w:left w:w="120" w:type="dxa"/>
+              <w:bottom w:w="80" w:type="dxa"/>
+              <w:right w:w="120" w:type="dxa"/>
+            </w:tcMar>
+            <w:vAlign w:val="center"/>
+          </w:tcPr>
+          <w:p>
+            <w:pPr>
+              <w:spacing w:after="0"/>
+              <w:jc w:val="both"/>
+            </w:pPr>
+            <w:r>
+              <w:rPr>
+                <w:rFonts w:ascii="Ubuntu" w:hAnsi="Ubuntu" w:cs="Ubuntu"/>
+                <w:sz w:val="21"/>
+                <w:szCs w:val="21"/>
+              </w:rPr>
+              <w:t xml:space="preserve">CM Consulting</w:t>
+            </w:r>
+          </w:p>
+        </w:tc>
+        <w:tc>
+          <w:tcPr>
+            <w:tcW w:w="1500" w:type="dxa"/>
+            <w:tcMar>
+              <w:top w:w="80" w:type="dxa"/>
+              <w:left w:w="120" w:type="dxa"/>
+              <w:bottom w:w="80" w:type="dxa"/>
+              <w:right w:w="120" w:type="dxa"/>
+            </w:tcMar>
+            <w:vAlign w:val="center"/>
+          </w:tcPr>
+          <w:p>
+            <w:pPr>
+              <w:spacing w:after="0"/>
+              <w:jc w:val="both"/>
+            </w:pPr>
+            <w:r>
+              <w:rPr>
+                <w:rFonts w:ascii="Ubuntu" w:hAnsi="Ubuntu" w:cs="Ubuntu"/>
+                <w:sz w:val="21"/>
+                <w:szCs w:val="21"/>
+              </w:rPr>
+              <w:t xml:space="preserve">16-Oct-26</w:t>
+            </w:r>
+          </w:p>
+        </w:tc>
+        <w:tc>
+          <w:tcPr>
+            <w:tcW w:w="3938" w:type="dxa"/>
+            <w:tcMar>
+              <w:top w:w="80" w:type="dxa"/>
+              <w:left w:w="120" w:type="dxa"/>
+              <w:bottom w:w="80" w:type="dxa"/>
+              <w:right w:w="120" w:type="dxa"/>
+            </w:tcMar>
+            <w:vAlign w:val="center"/>
+          </w:tcPr>
+          <w:p>
+            <w:pPr>
+              <w:spacing w:after="0"/>
+              <w:jc w:val="both"/>
+            </w:pPr>
+            <w:r>
+              <w:rPr>
+                <w:rFonts w:ascii="Ubuntu" w:hAnsi="Ubuntu" w:cs="Ubuntu"/>
+                <w:sz w:val="21"/>
+                <w:szCs w:val="21"/>
+              </w:rPr>
+              <w:t xml:space="preserve">Alineado con el DAF v1.2: UX-01 y UX-02 muestran el rechazo de la arquitectura B (RN-19, HU-57).</w:t>
+            </w:r>
+          </w:p>
+        </w:tc>
+      </w:tr>
     </w:tbl>
     <w:p>
       <w:pPr>
@@ -630,7 +736,7 @@
           <w:sz w:val="22"/>
           <w:szCs w:val="22"/>
         </w:rPr>
-        <w:t xml:space="preserve">. Deriva del Documento de Análisis Funcional v1.1 (16-Oct-26) y del brief de diseño de la misma fecha. Las historias de usuario referencian los códigos UX-XX de este documento en sus criterios de aceptación.</w:t>
+        <w:t xml:space="preserve">. Deriva del Documento de Análisis Funcional v1.2 (16-Oct-26) y del brief de diseño de la misma fecha. Las historias de usuario referencian los códigos UX-XX de este documento en sus criterios de aceptación.</w:t>
       </w:r>
     </w:p>
     <w:p>
@@ -4100,7 +4206,7 @@
                 <w:sz w:val="21"/>
                 <w:szCs w:val="21"/>
               </w:rPr>
-              <w:t xml:space="preserve">Lista cliente, arquitectura, paso actual, estado, última ejecución y usuario. Clic en el cliente abre su paso actual.</w:t>
+              <w:t xml:space="preserve">Lista cliente, arquitectura, paso actual, estado, última ejecución y usuario. Clic en el cliente abre su paso actual. Un cliente con arquitectura B aparece «No soportado».</w:t>
             </w:r>
           </w:p>
         </w:tc>
@@ -4126,7 +4232,7 @@
                 <w:sz w:val="21"/>
                 <w:szCs w:val="21"/>
               </w:rPr>
-              <w:t xml:space="preserve">RF-01, RF-04</w:t>
+              <w:t xml:space="preserve">RF-01, RF-04, RN-19</w:t>
             </w:r>
           </w:p>
         </w:tc>
@@ -4922,7 +5028,7 @@
                 <w:sz w:val="21"/>
                 <w:szCs w:val="21"/>
               </w:rPr>
-              <w:t xml:space="preserve">Insignia A o B, versiones detectadas y estado Variante disponible.</w:t>
+              <w:t xml:space="preserve">Insignia A o B y versiones detectadas. En A: Variante disponible. En B: «Arquitectura B no soportada en la versión 1» y Continuar deshabilitado.</w:t>
             </w:r>
           </w:p>
         </w:tc>
@@ -4948,7 +5054,7 @@
                 <w:sz w:val="21"/>
                 <w:szCs w:val="21"/>
               </w:rPr>
-              <w:t xml:space="preserve">RF-04, RNF-Comp-04</w:t>
+              <w:t xml:space="preserve">RF-04, RNF-Comp-04, RN-19</w:t>
             </w:r>
           </w:p>
         </w:tc>
@@ -5328,6 +5434,31 @@
           <w:szCs w:val="22"/>
         </w:rPr>
         <w:t xml:space="preserve">Versión sin variante disponible: aviso «Versión no soportada aún» y no se puede continuar (RNF-Comp-04). No prototipado.</w:t>
+      </w:r>
+    </w:p>
+    <w:p>
+      <w:pPr>
+        <w:pStyle w:val="ListParagraph"/>
+        <w:numPr>
+          <w:ilvl w:val="0"/>
+          <w:numId w:val="1"/>
+        </w:numPr>
+        <w:spacing w:before="0" w:after="80" w:line="288" w:lineRule="auto"/>
+        <w:ind w:left="720" w:hanging="360"/>
+        <w:contextualSpacing/>
+        <w:jc w:val="both"/>
+        <w:rPr>
+          <w:color w:val="000000"/>
+          <w:sz w:val="22"/>
+        </w:rPr>
+      </w:pPr>
+      <w:r>
+        <w:rPr>
+          <w:rFonts w:ascii="Ubuntu" w:hAnsi="Ubuntu" w:cs="Ubuntu"/>
+          <w:sz w:val="22"/>
+          <w:szCs w:val="22"/>
+        </w:rPr>
+        <w:t xml:space="preserve">Arquitectura B: se informa que no está soportada en la versión 1 y no se puede continuar (RN-19, HU-57).</w:t>
       </w:r>
     </w:p>
     <w:p>

</xml_diff>